<commit_message>
Work Knowledge - 10/23/2025 part 5
</commit_message>
<xml_diff>
--- a/Knowledge/2-Science/3-Social science/Social science Collection.docx
+++ b/Knowledge/2-Science/3-Social science/Social science Collection.docx
@@ -32,7 +32,7 @@
         <w:t>64</w:t>
       </w:r>
       <w:r>
-        <w:t>2</w:t>
+        <w:t>4</w:t>
       </w:r>
     </w:p>
     <w:p/>
@@ -392,22 +392,13 @@
           <w:sz w:val="18"/>
           <w:szCs w:val="18"/>
         </w:rPr>
-        <w:t>Learning Source</w:t>
-      </w:r>
-      <w:r>
-        <w:rPr>
-          <w:b/>
-          <w:bCs/>
+        <w:t xml:space="preserve">Learning Source: </w:t>
+      </w:r>
+      <w:r>
+        <w:rPr>
           <w:sz w:val="18"/>
           <w:szCs w:val="18"/>
         </w:rPr>
-        <w:t xml:space="preserve">: </w:t>
-      </w:r>
-      <w:r>
-        <w:rPr>
-          <w:sz w:val="18"/>
-          <w:szCs w:val="18"/>
-        </w:rPr>
         <w:t>Linguistics an introduction to language and communication - Chapter 1 - What Is Linguistics?</w:t>
       </w:r>
     </w:p>
@@ -18233,6 +18224,108 @@
           <w:szCs w:val="22"/>
         </w:rPr>
         <w:t>Appositive Attribute</w:t>
+      </w:r>
+    </w:p>
+    <w:p>
+      <w:pPr>
+        <w:pStyle w:val="ListParagraph"/>
+        <w:numPr>
+          <w:ilvl w:val="0"/>
+          <w:numId w:val="3"/>
+        </w:numPr>
+        <w:rPr>
+          <w:sz w:val="22"/>
+          <w:szCs w:val="22"/>
+        </w:rPr>
+      </w:pPr>
+      <w:r>
+        <w:rPr>
+          <w:b/>
+          <w:sz w:val="22"/>
+          <w:szCs w:val="22"/>
+        </w:rPr>
+        <w:t>643:</w:t>
+      </w:r>
+      <w:r>
+        <w:rPr>
+          <w:sz w:val="22"/>
+          <w:szCs w:val="22"/>
+        </w:rPr>
+        <w:t xml:space="preserve"> </w:t>
+      </w:r>
+      <w:r>
+        <w:rPr>
+          <w:b/>
+          <w:sz w:val="22"/>
+          <w:szCs w:val="22"/>
+        </w:rPr>
+        <w:t xml:space="preserve">My Source: </w:t>
+      </w:r>
+      <w:r>
+        <w:rPr>
+          <w:sz w:val="22"/>
+          <w:szCs w:val="22"/>
+        </w:rPr>
+        <w:t>Chomsky's Three Models of Language</w:t>
+      </w:r>
+    </w:p>
+    <w:p>
+      <w:pPr>
+        <w:pStyle w:val="ListParagraph"/>
+        <w:numPr>
+          <w:ilvl w:val="0"/>
+          <w:numId w:val="3"/>
+        </w:numPr>
+        <w:rPr>
+          <w:sz w:val="22"/>
+          <w:szCs w:val="22"/>
+        </w:rPr>
+      </w:pPr>
+      <w:r>
+        <w:rPr>
+          <w:b/>
+          <w:sz w:val="22"/>
+          <w:szCs w:val="22"/>
+        </w:rPr>
+        <w:t>64</w:t>
+      </w:r>
+      <w:r>
+        <w:rPr>
+          <w:b/>
+          <w:sz w:val="22"/>
+          <w:szCs w:val="22"/>
+        </w:rPr>
+        <w:t>4</w:t>
+      </w:r>
+      <w:r>
+        <w:rPr>
+          <w:b/>
+          <w:sz w:val="22"/>
+          <w:szCs w:val="22"/>
+        </w:rPr>
+        <w:t>:</w:t>
+      </w:r>
+      <w:r>
+        <w:rPr>
+          <w:sz w:val="22"/>
+          <w:szCs w:val="22"/>
+        </w:rPr>
+        <w:t xml:space="preserve"> </w:t>
+      </w:r>
+      <w:r>
+        <w:rPr>
+          <w:b/>
+          <w:sz w:val="22"/>
+          <w:szCs w:val="22"/>
+        </w:rPr>
+        <w:t xml:space="preserve">My Source: </w:t>
+      </w:r>
+      <w:r>
+        <w:rPr>
+          <w:sz w:val="22"/>
+          <w:szCs w:val="22"/>
+        </w:rPr>
+        <w:t>Universality of Human Language</w:t>
       </w:r>
     </w:p>
     <w:sectPr>

</xml_diff>